<commit_message>
Updated sumuuar cards and instructor guides.
</commit_message>
<xml_diff>
--- a/curriculum/instructor-guides-doc/FRC_Lesson02_InstructorGuide.docx
+++ b/curriculum/instructor-guides-doc/FRC_Lesson02_InstructorGuide.docx
@@ -9819,6 +9819,914 @@
         <w:t xml:space="preserve">Six magic numbers are hiding in the seeded project — hardcoded directly in files instead of Constants.java or relevant constant classes. Students find each one, move it, and rebuild.</w:t>
       </w:r>
     </w:p>
+    <w:p>
+      <w:pPr>
+        <w:spacing w:after="80"/>
+      </w:pPr>
+    </w:p>
+    <w:p>
+      <w:pPr>
+        <w:spacing w:after="80"/>
+      </w:pPr>
+      <w:r>
+        <w:rPr>
+          <w:b/>
+          <w:bCs/>
+          <w:i w:val="false"/>
+          <w:iCs w:val="false"/>
+          <w:color w:val="000000"/>
+          <w:sz w:val="20"/>
+          <w:szCs w:val="20"/>
+        </w:rPr>
+        <w:t xml:space="preserve">Pre-hunt reference — teach before students start</w:t>
+      </w:r>
+    </w:p>
+    <w:p>
+      <w:pPr>
+        <w:spacing w:after="80"/>
+      </w:pPr>
+      <w:r>
+        <w:rPr>
+          <w:b w:val="false"/>
+          <w:bCs w:val="false"/>
+          <w:i w:val="false"/>
+          <w:iCs w:val="false"/>
+          <w:color w:val="000000"/>
+          <w:sz w:val="20"/>
+          <w:szCs w:val="20"/>
+        </w:rPr>
+        <w:t xml:space="preserve">Walk through the three reference boxes in the handout on the projector before releasing students to work independently.</w:t>
+      </w:r>
+    </w:p>
+    <w:tbl>
+      <w:tblPr>
+        <w:tblW w:type="dxa" w:w="10080"/>
+        <w:tblBorders>
+          <w:top w:val="single" w:color="auto" w:sz="4"/>
+          <w:left w:val="single" w:color="auto" w:sz="4"/>
+          <w:bottom w:val="single" w:color="auto" w:sz="4"/>
+          <w:right w:val="single" w:color="auto" w:sz="4"/>
+        </w:tblBorders>
+      </w:tblPr>
+      <w:tblGrid>
+        <w:gridCol w:w="10080"/>
+      </w:tblGrid>
+      <w:tr>
+        <w:tc>
+          <w:tcPr>
+            <w:tcW w:type="dxa" w:w="10080"/>
+            <w:tcBorders>
+              <w:top w:val="single" w:color="2E75B6" w:sz="4"/>
+              <w:left w:val="single" w:color="2E75B6" w:sz="4"/>
+              <w:bottom w:val="single" w:color="2E75B6" w:sz="4"/>
+              <w:right w:val="single" w:color="2E75B6" w:sz="4"/>
+            </w:tcBorders>
+            <w:shd w:fill="EEF4FB" w:val="clear"/>
+            <w:tcMar>
+              <w:top w:type="dxa" w:w="80"/>
+              <w:left w:type="dxa" w:w="120"/>
+              <w:bottom w:type="dxa" w:w="80"/>
+              <w:right w:type="dxa" w:w="120"/>
+            </w:tcMar>
+          </w:tcPr>
+          <w:p>
+            <w:pPr>
+              <w:spacing w:after="80"/>
+            </w:pPr>
+            <w:r>
+              <w:rPr>
+                <w:b/>
+                <w:bCs/>
+                <w:i w:val="false"/>
+                <w:iCs w:val="false"/>
+                <w:color w:val="1B3A6B"/>
+                <w:sz w:val="20"/>
+                <w:szCs w:val="20"/>
+              </w:rPr>
+              <w:t>Box 1 — How to declare a constant</w:t>
+            </w:r>
+          </w:p>
+          <w:p>
+            <w:pPr>
+              <w:spacing w:after="60"/>
+            </w:pPr>
+            <w:r>
+              <w:rPr>
+                <w:b w:val="false"/>
+                <w:bCs w:val="false"/>
+                <w:i w:val="false"/>
+                <w:iCs w:val="false"/>
+                <w:color w:val="000000"/>
+                <w:sz w:val="20"/>
+                <w:szCs w:val="20"/>
+              </w:rPr>
+              <w:t xml:space="preserve">The three-word recipe: </w:t>
+            </w:r>
+            <w:r>
+              <w:rPr>
+                <w:b/>
+                <w:bCs/>
+                <w:i w:val="false"/>
+                <w:iCs w:val="false"/>
+                <w:color w:val="000000"/>
+                <w:sz w:val="20"/>
+                <w:szCs w:val="20"/>
+              </w:rPr>
+              <w:t>public static final</w:t>
+            </w:r>
+            <w:r>
+              <w:rPr>
+                <w:b w:val="false"/>
+                <w:bCs w:val="false"/>
+                <w:i w:val="false"/>
+                <w:iCs w:val="false"/>
+                <w:color w:val="000000"/>
+                <w:sz w:val="20"/>
+                <w:szCs w:val="20"/>
+              </w:rPr>
+              <w:t xml:space="preserve">. Every constant in WPILib uses this pattern.</w:t>
+            </w:r>
+          </w:p>
+          <w:p>
+            <w:pPr>
+              <w:spacing w:after="40"/>
+              <w:ind w:left="240"/>
+            </w:pPr>
+            <w:r>
+              <w:rPr>
+                <w:b w:val="false"/>
+                <w:bCs w:val="false"/>
+                <w:i w:val="false"/>
+                <w:iCs w:val="false"/>
+                <w:color w:val="000000"/>
+                <w:sz w:val="18"/>
+                <w:szCs w:val="18"/>
+              </w:rPr>
+              <w:t>public static final double kSpeedLimit = 0.8;</w:t>
+            </w:r>
+          </w:p>
+          <w:p>
+            <w:pPr>
+              <w:spacing w:after="40"/>
+              <w:ind w:left="240"/>
+            </w:pPr>
+            <w:r>
+              <w:rPr>
+                <w:b w:val="false"/>
+                <w:bCs w:val="false"/>
+                <w:i w:val="false"/>
+                <w:iCs w:val="false"/>
+                <w:color w:val="000000"/>
+                <w:sz w:val="18"/>
+                <w:szCs w:val="18"/>
+              </w:rPr>
+              <w:t>public static final int    kLeftMotorPort = 0;</w:t>
+            </w:r>
+          </w:p>
+          <w:p>
+            <w:pPr>
+              <w:spacing w:after="60"/>
+              <w:ind w:left="240"/>
+            </w:pPr>
+            <w:r>
+              <w:rPr>
+                <w:b w:val="false"/>
+                <w:bCs w:val="false"/>
+                <w:i w:val="false"/>
+                <w:iCs w:val="false"/>
+                <w:color w:val="000000"/>
+                <w:sz w:val="18"/>
+                <w:szCs w:val="18"/>
+              </w:rPr>
+              <w:t>public static final String kProjectName = "BearBots";</w:t>
+            </w:r>
+          </w:p>
+          <w:p>
+            <w:pPr>
+              <w:spacing w:after="40"/>
+            </w:pPr>
+            <w:r>
+              <w:rPr>
+                <w:b w:val="false"/>
+                <w:bCs w:val="false"/>
+                <w:i w:val="false"/>
+                <w:iCs w:val="false"/>
+                <w:color w:val="000000"/>
+                <w:sz w:val="20"/>
+                <w:szCs w:val="20"/>
+              </w:rPr>
+              <w:t xml:space="preserve">Why all three? </w:t>
+            </w:r>
+            <w:r>
+              <w:rPr>
+                <w:b/>
+                <w:bCs/>
+                <w:color w:val="000000"/>
+                <w:sz w:val="20"/>
+                <w:szCs w:val="20"/>
+              </w:rPr>
+              <w:t>public</w:t>
+            </w:r>
+            <w:r>
+              <w:rPr>
+                <w:b w:val="false"/>
+                <w:bCs w:val="false"/>
+                <w:color w:val="000000"/>
+                <w:sz w:val="20"/>
+                <w:szCs w:val="20"/>
+              </w:rPr>
+              <w:t xml:space="preserve"> — any file can read it. </w:t>
+            </w:r>
+            <w:r>
+              <w:rPr>
+                <w:b/>
+                <w:bCs/>
+                <w:color w:val="000000"/>
+                <w:sz w:val="20"/>
+                <w:szCs w:val="20"/>
+              </w:rPr>
+              <w:t>static</w:t>
+            </w:r>
+            <w:r>
+              <w:rPr>
+                <w:b w:val="false"/>
+                <w:bCs w:val="false"/>
+                <w:color w:val="000000"/>
+                <w:sz w:val="20"/>
+                <w:szCs w:val="20"/>
+              </w:rPr>
+              <w:t xml:space="preserve"> — belongs to the class, not an instance; no new Constants() needed. </w:t>
+            </w:r>
+            <w:r>
+              <w:rPr>
+                <w:b/>
+                <w:bCs/>
+                <w:color w:val="000000"/>
+                <w:sz w:val="20"/>
+                <w:szCs w:val="20"/>
+              </w:rPr>
+              <w:t>final</w:t>
+            </w:r>
+            <w:r>
+              <w:rPr>
+                <w:b w:val="false"/>
+                <w:bCs w:val="false"/>
+                <w:color w:val="000000"/>
+                <w:sz w:val="20"/>
+                <w:szCs w:val="20"/>
+              </w:rPr>
+              <w:t xml:space="preserve"> — locked after startup; can never be reassigned.</w:t>
+            </w:r>
+          </w:p>
+          <w:p>
+            <w:pPr>
+              <w:spacing w:after="60"/>
+            </w:pPr>
+            <w:r>
+              <w:rPr>
+                <w:b w:val="false"/>
+                <w:bCs w:val="false"/>
+                <w:i w:val="false"/>
+                <w:iCs w:val="false"/>
+                <w:color w:val="000000"/>
+                <w:sz w:val="20"/>
+                <w:szCs w:val="20"/>
+              </w:rPr>
+              <w:t xml:space="preserve">Constants live inside inner classes inside Constants.java. If the inner class doesn’t exist yet, students create it — copy the public static class block and give it a new name.</w:t>
+            </w:r>
+          </w:p>
+          <w:p>
+            <w:pPr>
+              <w:spacing w:after="60"/>
+            </w:pPr>
+            <w:r>
+              <w:rPr>
+                <w:b/>
+                <w:bCs/>
+                <w:i w:val="false"/>
+                <w:iCs w:val="false"/>
+                <w:color w:val="1B3A6B"/>
+                <w:sz w:val="20"/>
+                <w:szCs w:val="20"/>
+              </w:rPr>
+              <w:t>5th-grade version</w:t>
+            </w:r>
+          </w:p>
+          <w:p>
+            <w:pPr>
+              <w:spacing w:after="60"/>
+            </w:pPr>
+            <w:r>
+              <w:rPr>
+                <w:b w:val="false"/>
+                <w:bCs w:val="false"/>
+                <w:i w:val="false"/>
+                <w:iCs w:val="false"/>
+                <w:color w:val="000000"/>
+                <w:sz w:val="20"/>
+                <w:szCs w:val="20"/>
+              </w:rPr>
+              <w:t xml:space="preserve">A constant is a sticky note on the wall that everyone can read but nobody can change. public means it’s posted where everyone can see it. static means it belongs to the room, not any one person. final means it’s laminated — you can read it but you can’t write on it.</w:t>
+            </w:r>
+          </w:p>
+        </w:tc>
+      </w:tr>
+    </w:tbl>
+    <w:p>
+      <w:pPr>
+        <w:spacing w:after="80"/>
+      </w:pPr>
+    </w:p>
+    <w:tbl>
+      <w:tblPr>
+        <w:tblW w:type="dxa" w:w="10080"/>
+        <w:tblBorders>
+          <w:top w:val="single" w:color="auto" w:sz="4"/>
+          <w:left w:val="single" w:color="auto" w:sz="4"/>
+          <w:bottom w:val="single" w:color="auto" w:sz="4"/>
+          <w:right w:val="single" w:color="auto" w:sz="4"/>
+        </w:tblBorders>
+      </w:tblPr>
+      <w:tblGrid>
+        <w:gridCol w:w="10080"/>
+      </w:tblGrid>
+      <w:tr>
+        <w:tc>
+          <w:tcPr>
+            <w:tcW w:type="dxa" w:w="10080"/>
+            <w:tcBorders>
+              <w:top w:val="single" w:color="2E75B6" w:sz="4"/>
+              <w:left w:val="single" w:color="2E75B6" w:sz="4"/>
+              <w:bottom w:val="single" w:color="2E75B6" w:sz="4"/>
+              <w:right w:val="single" w:color="2E75B6" w:sz="4"/>
+            </w:tcBorders>
+            <w:shd w:fill="EEF4FB" w:val="clear"/>
+            <w:tcMar>
+              <w:top w:type="dxa" w:w="80"/>
+              <w:left w:type="dxa" w:w="120"/>
+              <w:bottom w:type="dxa" w:w="80"/>
+              <w:right w:type="dxa" w:w="120"/>
+            </w:tcMar>
+          </w:tcPr>
+          <w:p>
+            <w:pPr>
+              <w:spacing w:after="80"/>
+            </w:pPr>
+            <w:r>
+              <w:rPr>
+                <w:b/>
+                <w:bCs/>
+                <w:i w:val="false"/>
+                <w:iCs w:val="false"/>
+                <w:color w:val="1B3A6B"/>
+                <w:sz w:val="20"/>
+                <w:szCs w:val="20"/>
+              </w:rPr>
+              <w:t>Box 2 — How to import and use a constant in another file</w:t>
+            </w:r>
+          </w:p>
+          <w:p>
+            <w:pPr>
+              <w:spacing w:after="40"/>
+            </w:pPr>
+            <w:r>
+              <w:rPr>
+                <w:b w:val="false"/>
+                <w:bCs w:val="false"/>
+                <w:i w:val="false"/>
+                <w:iCs w:val="false"/>
+                <w:color w:val="000000"/>
+                <w:sz w:val="20"/>
+                <w:szCs w:val="20"/>
+              </w:rPr>
+              <w:t>Add an import at the top of the file, then use the constant by name:</w:t>
+            </w:r>
+          </w:p>
+          <w:p>
+            <w:pPr>
+              <w:spacing w:after="40"/>
+              <w:ind w:left="240"/>
+            </w:pPr>
+            <w:r>
+              <w:rPr>
+                <w:b w:val="false"/>
+                <w:bCs w:val="false"/>
+                <w:color w:val="000000"/>
+                <w:sz w:val="18"/>
+                <w:szCs w:val="18"/>
+              </w:rPr>
+              <w:t>import frc.robot.Constants.DriveConstants;</w:t>
+            </w:r>
+          </w:p>
+          <w:p>
+            <w:pPr>
+              <w:spacing w:after="60"/>
+              <w:ind w:left="240"/>
+            </w:pPr>
+            <w:r>
+              <w:rPr>
+                <w:b w:val="false"/>
+                <w:bCs w:val="false"/>
+                <w:color w:val="000000"/>
+                <w:sz w:val="18"/>
+                <w:szCs w:val="18"/>
+              </w:rPr>
+              <w:t>xaxisSpeed = MathUtil.clamp(xaxisSpeed, -1.0, 1.0) * DriveConstants.kSpeedLimit;</w:t>
+            </w:r>
+          </w:p>
+          <w:p>
+            <w:pPr>
+              <w:spacing w:after="60"/>
+            </w:pPr>
+            <w:r>
+              <w:rPr>
+                <w:b w:val="false"/>
+                <w:bCs w:val="false"/>
+                <w:i w:val="false"/>
+                <w:iCs w:val="false"/>
+                <w:color w:val="000000"/>
+                <w:sz w:val="20"/>
+                <w:szCs w:val="20"/>
+              </w:rPr>
+              <w:t xml:space="preserve">No import needed if using the fully-qualified name: </w:t>
+            </w:r>
+            <w:r>
+              <w:rPr>
+                <w:b/>
+                <w:bCs/>
+                <w:color w:val="000000"/>
+                <w:sz w:val="20"/>
+                <w:szCs w:val="20"/>
+              </w:rPr>
+              <w:t>Constants.DriveConstants.kSpeedLimit</w:t>
+            </w:r>
+          </w:p>
+          <w:p>
+            <w:pPr>
+              <w:spacing w:after="60"/>
+            </w:pPr>
+            <w:r>
+              <w:rPr>
+                <w:b/>
+                <w:bCs/>
+                <w:i w:val="false"/>
+                <w:iCs w:val="false"/>
+                <w:color w:val="1B3A6B"/>
+                <w:sz w:val="20"/>
+                <w:szCs w:val="20"/>
+              </w:rPr>
+              <w:t>VS Code quick-fix import — demo this before the hunt starts</w:t>
+            </w:r>
+          </w:p>
+          <w:p>
+            <w:pPr>
+              <w:spacing w:after="60"/>
+            </w:pPr>
+            <w:r>
+              <w:rPr>
+                <w:b w:val="false"/>
+                <w:bCs w:val="false"/>
+                <w:i w:val="false"/>
+                <w:iCs w:val="false"/>
+                <w:color w:val="000000"/>
+                <w:sz w:val="20"/>
+                <w:szCs w:val="20"/>
+              </w:rPr>
+              <w:t xml:space="preserve">When a student types a constant name that hasn’t been imported yet, VS Code underlines it red. Hover it (or press </w:t>
+            </w:r>
+            <w:r>
+              <w:rPr>
+                <w:b/>
+                <w:bCs/>
+                <w:color w:val="000000"/>
+                <w:sz w:val="20"/>
+                <w:szCs w:val="20"/>
+              </w:rPr>
+              <w:t>Ctrl+.</w:t>
+            </w:r>
+            <w:r>
+              <w:rPr>
+                <w:b w:val="false"/>
+                <w:bCs w:val="false"/>
+                <w:color w:val="000000"/>
+                <w:sz w:val="20"/>
+                <w:szCs w:val="20"/>
+              </w:rPr>
+              <w:t xml:space="preserve">) and choose </w:t>
+            </w:r>
+            <w:r>
+              <w:rPr>
+                <w:b/>
+                <w:bCs/>
+                <w:color w:val="000000"/>
+                <w:sz w:val="20"/>
+                <w:szCs w:val="20"/>
+              </w:rPr>
+              <w:t>Add import</w:t>
+            </w:r>
+            <w:r>
+              <w:rPr>
+                <w:b w:val="false"/>
+                <w:bCs w:val="false"/>
+                <w:color w:val="000000"/>
+                <w:sz w:val="20"/>
+                <w:szCs w:val="20"/>
+              </w:rPr>
+              <w:t xml:space="preserve">. VS Code writes the import line automatically. This is the one shortcut worth demoing on the projector before students start.</w:t>
+            </w:r>
+          </w:p>
+        </w:tc>
+      </w:tr>
+    </w:tbl>
+    <w:p>
+      <w:pPr>
+        <w:spacing w:after="80"/>
+      </w:pPr>
+    </w:p>
+    <w:tbl>
+      <w:tblPr>
+        <w:tblW w:type="dxa" w:w="10080"/>
+        <w:tblBorders>
+          <w:top w:val="single" w:color="auto" w:sz="4"/>
+          <w:left w:val="single" w:color="auto" w:sz="4"/>
+          <w:bottom w:val="single" w:color="auto" w:sz="4"/>
+          <w:right w:val="single" w:color="auto" w:sz="4"/>
+        </w:tblBorders>
+      </w:tblPr>
+      <w:tblGrid>
+        <w:gridCol w:w="10080"/>
+      </w:tblGrid>
+      <w:tr>
+        <w:tc>
+          <w:tcPr>
+            <w:tcW w:type="dxa" w:w="10080"/>
+            <w:tcBorders>
+              <w:top w:val="single" w:color="2E75B6" w:sz="4"/>
+              <w:left w:val="single" w:color="2E75B6" w:sz="4"/>
+              <w:bottom w:val="single" w:color="2E75B6" w:sz="4"/>
+              <w:right w:val="single" w:color="2E75B6" w:sz="4"/>
+            </w:tcBorders>
+            <w:shd w:fill="EEF4FB" w:val="clear"/>
+            <w:tcMar>
+              <w:top w:type="dxa" w:w="80"/>
+              <w:left w:type="dxa" w:w="120"/>
+              <w:bottom w:type="dxa" w:w="80"/>
+              <w:right w:type="dxa" w:w="120"/>
+            </w:tcMar>
+          </w:tcPr>
+          <w:p>
+            <w:pPr>
+              <w:spacing w:after="80"/>
+            </w:pPr>
+            <w:r>
+              <w:rPr>
+                <w:b/>
+                <w:bCs/>
+                <w:i w:val="false"/>
+                <w:iCs w:val="false"/>
+                <w:color w:val="1B3A6B"/>
+                <w:sz w:val="20"/>
+                <w:szCs w:val="20"/>
+              </w:rPr>
+              <w:t>Box 3 — The k naming rule</w:t>
+            </w:r>
+          </w:p>
+          <w:p>
+            <w:pPr>
+              <w:spacing w:after="60"/>
+            </w:pPr>
+            <w:r>
+              <w:rPr>
+                <w:b w:val="false"/>
+                <w:bCs w:val="false"/>
+                <w:i w:val="false"/>
+                <w:iCs w:val="false"/>
+                <w:color w:val="000000"/>
+                <w:sz w:val="20"/>
+                <w:szCs w:val="20"/>
+              </w:rPr>
+              <w:t xml:space="preserve">All WPILib constants start with lowercase </w:t>
+            </w:r>
+            <w:r>
+              <w:rPr>
+                <w:b/>
+                <w:bCs/>
+                <w:color w:val="000000"/>
+                <w:sz w:val="20"/>
+                <w:szCs w:val="20"/>
+              </w:rPr>
+              <w:t>k</w:t>
+            </w:r>
+            <w:r>
+              <w:rPr>
+                <w:b w:val="false"/>
+                <w:bCs w:val="false"/>
+                <w:color w:val="000000"/>
+                <w:sz w:val="20"/>
+                <w:szCs w:val="20"/>
+              </w:rPr>
+              <w:t xml:space="preserve">, followed by UpperCamelCase. This convention appears across every WPILib source file. Students who use it look like they’ve been writing robot code for years.</w:t>
+            </w:r>
+          </w:p>
+          <w:p>
+            <w:pPr>
+              <w:spacing w:after="40"/>
+            </w:pPr>
+            <w:r>
+              <w:rPr>
+                <w:b/>
+                <w:bCs/>
+                <w:color w:val="000000"/>
+                <w:sz w:val="20"/>
+                <w:szCs w:val="20"/>
+              </w:rPr>
+              <w:t>Examples by category:</w:t>
+            </w:r>
+          </w:p>
+          <w:p>
+            <w:pPr>
+              <w:spacing w:after="20"/>
+              <w:ind w:left="240"/>
+            </w:pPr>
+            <w:r>
+              <w:rPr>
+                <w:b/>
+                <w:bCs/>
+                <w:color w:val="000000"/>
+                <w:sz w:val="20"/>
+                <w:szCs w:val="20"/>
+              </w:rPr>
+              <w:t xml:space="preserve">Speeds/power: </w:t>
+            </w:r>
+            <w:r>
+              <w:rPr>
+                <w:b w:val="false"/>
+                <w:bCs w:val="false"/>
+                <w:color w:val="000000"/>
+                <w:sz w:val="20"/>
+                <w:szCs w:val="20"/>
+              </w:rPr>
+              <w:t>kSpeedLimit, kMaxTurnSpeed, kAutodriveSpeed</w:t>
+            </w:r>
+          </w:p>
+          <w:p>
+            <w:pPr>
+              <w:spacing w:after="20"/>
+              <w:ind w:left="240"/>
+            </w:pPr>
+            <w:r>
+              <w:rPr>
+                <w:b/>
+                <w:bCs/>
+                <w:color w:val="000000"/>
+                <w:sz w:val="20"/>
+                <w:szCs w:val="20"/>
+              </w:rPr>
+              <w:t xml:space="preserve">Angles: </w:t>
+            </w:r>
+            <w:r>
+              <w:rPr>
+                <w:b w:val="false"/>
+                <w:bCs w:val="false"/>
+                <w:color w:val="000000"/>
+                <w:sz w:val="20"/>
+                <w:szCs w:val="20"/>
+              </w:rPr>
+              <w:t>kMaxAngleDeg, kStowedAngleDeg, kScoringAngleDeg</w:t>
+            </w:r>
+          </w:p>
+          <w:p>
+            <w:pPr>
+              <w:spacing w:after="20"/>
+              <w:ind w:left="240"/>
+            </w:pPr>
+            <w:r>
+              <w:rPr>
+                <w:b/>
+                <w:bCs/>
+                <w:color w:val="000000"/>
+                <w:sz w:val="20"/>
+                <w:szCs w:val="20"/>
+              </w:rPr>
+              <w:t xml:space="preserve">Distances: </w:t>
+            </w:r>
+            <w:r>
+              <w:rPr>
+                <w:b w:val="false"/>
+                <w:bCs w:val="false"/>
+                <w:color w:val="000000"/>
+                <w:sz w:val="20"/>
+                <w:szCs w:val="20"/>
+              </w:rPr>
+              <w:t>kWheelCircumferenceMeters, kTrackWidthMeters</w:t>
+            </w:r>
+          </w:p>
+          <w:p>
+            <w:pPr>
+              <w:spacing w:after="20"/>
+              <w:ind w:left="240"/>
+            </w:pPr>
+            <w:r>
+              <w:rPr>
+                <w:b/>
+                <w:bCs/>
+                <w:color w:val="000000"/>
+                <w:sz w:val="20"/>
+                <w:szCs w:val="20"/>
+              </w:rPr>
+              <w:t xml:space="preserve">Timing: </w:t>
+            </w:r>
+            <w:r>
+              <w:rPr>
+                <w:b w:val="false"/>
+                <w:bCs w:val="false"/>
+                <w:color w:val="000000"/>
+                <w:sz w:val="20"/>
+                <w:szCs w:val="20"/>
+              </w:rPr>
+              <w:t>kDriveTimeSeconds, kTurnTimeSeconds</w:t>
+            </w:r>
+          </w:p>
+          <w:p>
+            <w:pPr>
+              <w:spacing w:after="20"/>
+              <w:ind w:left="240"/>
+            </w:pPr>
+            <w:r>
+              <w:rPr>
+                <w:b/>
+                <w:bCs/>
+                <w:color w:val="000000"/>
+                <w:sz w:val="20"/>
+                <w:szCs w:val="20"/>
+              </w:rPr>
+              <w:t xml:space="preserve">Ports/IDs: </w:t>
+            </w:r>
+            <w:r>
+              <w:rPr>
+                <w:b w:val="false"/>
+                <w:bCs w:val="false"/>
+                <w:color w:val="000000"/>
+                <w:sz w:val="20"/>
+                <w:szCs w:val="20"/>
+              </w:rPr>
+              <w:t>kLeftMotorPort, kRightMotorPort, kControllerPort</w:t>
+            </w:r>
+          </w:p>
+          <w:p>
+            <w:pPr>
+              <w:spacing w:after="60"/>
+              <w:ind w:left="240"/>
+            </w:pPr>
+            <w:r>
+              <w:rPr>
+                <w:b/>
+                <w:bCs/>
+                <w:color w:val="000000"/>
+                <w:sz w:val="20"/>
+                <w:szCs w:val="20"/>
+              </w:rPr>
+              <w:t xml:space="preserve">Strings: </w:t>
+            </w:r>
+            <w:r>
+              <w:rPr>
+                <w:b w:val="false"/>
+                <w:bCs w:val="false"/>
+                <w:color w:val="000000"/>
+                <w:sz w:val="20"/>
+                <w:szCs w:val="20"/>
+              </w:rPr>
+              <w:t>kProjectName, kAutoDefault</w:t>
+            </w:r>
+          </w:p>
+          <w:p>
+            <w:pPr>
+              <w:spacing w:after="40"/>
+            </w:pPr>
+            <w:r>
+              <w:rPr>
+                <w:b/>
+                <w:bCs/>
+                <w:color w:val="000000"/>
+                <w:sz w:val="20"/>
+                <w:szCs w:val="20"/>
+              </w:rPr>
+              <w:t>Rules to teach explicitly:</w:t>
+            </w:r>
+          </w:p>
+          <w:p>
+            <w:pPr>
+              <w:spacing w:after="20"/>
+              <w:ind w:left="240"/>
+            </w:pPr>
+            <w:r>
+              <w:rPr>
+                <w:b w:val="false"/>
+                <w:bCs w:val="false"/>
+                <w:color w:val="000000"/>
+                <w:sz w:val="20"/>
+                <w:szCs w:val="20"/>
+              </w:rPr>
+              <w:t xml:space="preserve">Always start with k — speedLimit ✗ → kSpeedLimit ✓</w:t>
+            </w:r>
+          </w:p>
+          <w:p>
+            <w:pPr>
+              <w:spacing w:after="20"/>
+              <w:ind w:left="240"/>
+            </w:pPr>
+            <w:r>
+              <w:rPr>
+                <w:b w:val="false"/>
+                <w:bCs w:val="false"/>
+                <w:color w:val="000000"/>
+                <w:sz w:val="20"/>
+                <w:szCs w:val="20"/>
+              </w:rPr>
+              <w:t xml:space="preserve">Include the unit when ambiguous — kMaxAngle ✗ → kMaxAngleDeg ✓</w:t>
+            </w:r>
+          </w:p>
+          <w:p>
+            <w:pPr>
+              <w:spacing w:after="20"/>
+              <w:ind w:left="240"/>
+            </w:pPr>
+            <w:r>
+              <w:rPr>
+                <w:b w:val="false"/>
+                <w:bCs w:val="false"/>
+                <w:color w:val="000000"/>
+                <w:sz w:val="20"/>
+                <w:szCs w:val="20"/>
+              </w:rPr>
+              <w:t xml:space="preserve">No abbreviations unless obvious — kWC ✗ → kWheelCircumferenceMeters ✓</w:t>
+            </w:r>
+          </w:p>
+          <w:p>
+            <w:pPr>
+              <w:spacing w:after="20"/>
+              <w:ind w:left="240"/>
+            </w:pPr>
+            <w:r>
+              <w:rPr>
+                <w:b w:val="false"/>
+                <w:bCs w:val="false"/>
+                <w:color w:val="000000"/>
+                <w:sz w:val="20"/>
+                <w:szCs w:val="20"/>
+              </w:rPr>
+              <w:t xml:space="preserve">Drop the class name from the constant — DriveConstants.kDriveSpeed ✗ → DriveConstants.kSpeed ✓</w:t>
+            </w:r>
+          </w:p>
+          <w:p>
+            <w:pPr>
+              <w:spacing w:after="60"/>
+              <w:ind w:left="240"/>
+            </w:pPr>
+            <w:r>
+              <w:rPr>
+                <w:b w:val="false"/>
+                <w:bCs w:val="false"/>
+                <w:color w:val="000000"/>
+                <w:sz w:val="20"/>
+                <w:szCs w:val="20"/>
+              </w:rPr>
+              <w:t xml:space="preserve">Booleans: use kIs or kEnable prefix — kMotorInverted ✗ → kIsRightMotorInverted ✓</w:t>
+            </w:r>
+          </w:p>
+          <w:p>
+            <w:pPr>
+              <w:spacing w:after="60"/>
+            </w:pPr>
+            <w:r>
+              <w:rPr>
+                <w:b/>
+                <w:bCs/>
+                <w:color w:val="1B3A6B"/>
+                <w:sz w:val="20"/>
+                <w:szCs w:val="20"/>
+              </w:rPr>
+              <w:t>Why the unit rule matters</w:t>
+            </w:r>
+          </w:p>
+          <w:p>
+            <w:pPr>
+              <w:spacing w:after="60"/>
+            </w:pPr>
+            <w:r>
+              <w:rPr>
+                <w:b w:val="false"/>
+                <w:bCs w:val="false"/>
+                <w:color w:val="000000"/>
+                <w:sz w:val="20"/>
+                <w:szCs w:val="20"/>
+              </w:rPr>
+              <w:t xml:space="preserve">WPILib uses it everywhere: kMaxVelocityMetersPerSecond, kWheelRadiusMeters. A function expecting radians and receiving degrees gives you a robot that overshoots by 57×. The unit in the name is a free sanity check every time anyone reads the code.</w:t>
+            </w:r>
+          </w:p>
+        </w:tc>
+      </w:tr>
+    </w:tbl>
     <w:p>
       <w:pPr>
         <w:spacing w:after="80"/>

</xml_diff>

<commit_message>
updates for lesson 2 and 3. Lesson 3 updates before swapping parts 3 and 4.
</commit_message>
<xml_diff>
--- a/curriculum/instructor-guides-doc/FRC_Lesson02_InstructorGuide.docx
+++ b/curriculum/instructor-guides-doc/FRC_Lesson02_InstructorGuide.docx
@@ -4354,7 +4354,7 @@
           <w:sz w:val="20"/>
           <w:szCs w:val="20"/>
         </w:rPr>
-        <w:t xml:space="preserve">Key point: this isn't the only constants file. Real teams split: TunerConstants, FieldConstants, ArmConstants. That's a design decision. BearBots uses inner classes as a middle ground.</w:t>
+        <w:t xml:space="preserve">Key point: this isn't the only constants file. Real teams split: TunerConstants, FieldConstants, ArmConstants. BearBots encourages separate files from the start — one file per subsystem (DriveConstants.java, ArmConstants.java, etc.).</w:t>
       </w:r>
     </w:p>
     <w:p>
@@ -5229,7 +5229,7 @@
                 <w:sz w:val="18"/>
                 <w:szCs w:val="18"/>
               </w:rPr>
-              <w:t xml:space="preserve">Inner class structure — DriveHardware, etc.</w:t>
+              <w:t xml:space="preserve">Separate constants files — DriveConstants.java, ArmConstants.java, etc.</w:t>
             </w:r>
           </w:p>
         </w:tc>
@@ -10092,7 +10092,7 @@
                 <w:sz w:val="20"/>
                 <w:szCs w:val="20"/>
               </w:rPr>
-              <w:t xml:space="preserve">Constants live inside inner classes inside Constants.java. If the inner class doesn’t exist yet, students create it — copy the public static class block and give it a new name.</w:t>
+              <w:t xml:space="preserve">Each subsystem gets its own constants file. If the file doesn’t exist yet, create it — a new public final class with the subsystem name (e.g. ScoopConstants.java).</w:t>
             </w:r>
           </w:p>
           <w:p>
@@ -10215,7 +10215,7 @@
                 <w:sz w:val="18"/>
                 <w:szCs w:val="18"/>
               </w:rPr>
-              <w:t>import frc.robot.Constants.DriveConstants;</w:t>
+              <w:t>import frc.robot.DriveConstants;</w:t>
             </w:r>
           </w:p>
           <w:p>
@@ -10258,7 +10258,7 @@
                 <w:sz w:val="20"/>
                 <w:szCs w:val="20"/>
               </w:rPr>
-              <w:t>Constants.DriveConstants.kSpeedLimit</w:t>
+              <w:t>DriveConstants.kSpeedLimit</w:t>
             </w:r>
           </w:p>
           <w:p>
@@ -11614,7 +11614,7 @@
                 <w:sz w:val="18"/>
                 <w:szCs w:val="18"/>
               </w:rPr>
-              <w:t xml:space="preserve">New AutoConstants inner class in Constants.java</w:t>
+              <w:t xml:space="preserve">New AutoConstants.java file in the constants package</w:t>
             </w:r>
           </w:p>
         </w:tc>
@@ -11831,7 +11831,7 @@
                 <w:sz w:val="20"/>
                 <w:szCs w:val="20"/>
               </w:rPr>
-              <w:t xml:space="preserve">Two related magic numbers, a new inner class, and multiple call sites. Use as Silver/Gold challenge or skip for struggling students.</w:t>
+              <w:t xml:space="preserve">Two related magic numbers, a new constants file, and multiple call sites. Use as Silver/Gold challenge or skip for struggling students.</w:t>
             </w:r>
           </w:p>
         </w:tc>

</xml_diff>